<commit_message>
feat: circuito gerado por codigo + prints validacao + pdf/docx atualizados (#gcetens838 #simulacao02 #circuito)
</commit_message>
<xml_diff>
--- a/disciplinas/gcetens838-logica-para-computacao/atividades/exercicios/gcetens838-simulacao-02-relatorio-deivison-santana.docx
+++ b/disciplinas/gcetens838-logica-para-computacao/atividades/exercicios/gcetens838-simulacao-02-relatorio-deivison-santana.docx
@@ -25,7 +25,7 @@
         <w:t xml:space="preserve">BACHARELADO EM SISTEMAS DE INFORMACAO (EAD)</w:t>
       </w:r>
     </w:p>
-    <w:bookmarkStart w:id="29" w:name="X94c57e18311d3f8d2f6b4a0b09d33ceb9b68691"/>
+    <w:bookmarkStart w:id="32" w:name="X94c57e18311d3f8d2f6b4a0b09d33ceb9b68691"/>
     <w:p>
       <w:pPr>
         <w:pStyle w:val="Heading1"/>
@@ -2644,7 +2644,7 @@
     </w:p>
     <w:bookmarkEnd w:id="23"/>
     <w:bookmarkEnd w:id="24"/>
-    <w:bookmarkStart w:id="26" w:name="simulacao-no-circuitverse"/>
+    <w:bookmarkStart w:id="29" w:name="simulacao-no-circuitverse"/>
     <w:p>
       <w:pPr>
         <w:pStyle w:val="Heading2"/>
@@ -2679,17 +2679,60 @@
     </w:p>
     <w:p>
       <w:pPr>
-        <w:pStyle w:val="BodyText"/>
-      </w:pPr>
-      <w:r>
-        <w:rPr>
-          <w:i/>
-          <w:iCs/>
-        </w:rPr>
-        <w:t xml:space="preserve">[Placeholder: inserir print do circuito montado no CircuitVerse/Digisim.io]</w:t>
-      </w:r>
-    </w:p>
-    <w:bookmarkStart w:id="25" w:name="validacao-dos-16-estados"/>
+        <w:pStyle w:val="CaptionedFigure"/>
+      </w:pPr>
+      <w:r>
+        <w:drawing>
+          <wp:inline>
+            <wp:extent cx="5334000" cy="7516207"/>
+            <wp:effectExtent b="0" l="0" r="0" t="0"/>
+            <wp:docPr descr="Circuito e validacao das 16 combinacoes" title="" id="26" name="Picture"/>
+            <a:graphic>
+              <a:graphicData uri="http://schemas.openxmlformats.org/drawingml/2006/picture">
+                <pic:pic>
+                  <pic:nvPicPr>
+                    <pic:cNvPr descr="disciplinas/gcetens838-logica-para-computacao/atividades/exercicios/gcetens838-simulacao-02-prints.png" id="27" name="Picture"/>
+                    <pic:cNvPicPr>
+                      <a:picLocks noChangeArrowheads="1" noChangeAspect="1"/>
+                    </pic:cNvPicPr>
+                  </pic:nvPicPr>
+                  <pic:blipFill>
+                    <a:blip r:embed="rId25"/>
+                    <a:stretch>
+                      <a:fillRect/>
+                    </a:stretch>
+                  </pic:blipFill>
+                  <pic:spPr bwMode="auto">
+                    <a:xfrm>
+                      <a:off x="0" y="0"/>
+                      <a:ext cx="5334000" cy="7516207"/>
+                    </a:xfrm>
+                    <a:prstGeom prst="rect">
+                      <a:avLst/>
+                    </a:prstGeom>
+                    <a:noFill/>
+                    <a:ln w="9525">
+                      <a:noFill/>
+                      <a:headEnd/>
+                      <a:tailEnd/>
+                    </a:ln>
+                  </pic:spPr>
+                </pic:pic>
+              </a:graphicData>
+            </a:graphic>
+          </wp:inline>
+        </w:drawing>
+      </w:r>
+    </w:p>
+    <w:p>
+      <w:pPr>
+        <w:pStyle w:val="ImageCaption"/>
+      </w:pPr>
+      <w:r>
+        <w:t xml:space="preserve">Circuito e validacao das 16 combinacoes</w:t>
+      </w:r>
+    </w:p>
+    <w:bookmarkStart w:id="28" w:name="validacao-dos-16-estados"/>
     <w:p>
       <w:pPr>
         <w:pStyle w:val="Heading3"/>
@@ -2729,9 +2772,9 @@
         </w:pict>
       </w:r>
     </w:p>
-    <w:bookmarkEnd w:id="25"/>
-    <w:bookmarkEnd w:id="26"/>
-    <w:bookmarkStart w:id="27" w:name="conclusao"/>
+    <w:bookmarkEnd w:id="28"/>
+    <w:bookmarkEnd w:id="29"/>
+    <w:bookmarkStart w:id="30" w:name="conclusao"/>
     <w:p>
       <w:pPr>
         <w:pStyle w:val="Heading2"/>
@@ -2755,8 +2798,8 @@
         </w:pict>
       </w:r>
     </w:p>
-    <w:bookmarkEnd w:id="27"/>
-    <w:bookmarkStart w:id="28" w:name="referencias"/>
+    <w:bookmarkEnd w:id="30"/>
+    <w:bookmarkStart w:id="31" w:name="referencias"/>
     <w:p>
       <w:pPr>
         <w:pStyle w:val="Heading2"/>
@@ -2830,8 +2873,8 @@
         <w:t xml:space="preserve">Relatorio entregue em 13 de julho de 2026</w:t>
       </w:r>
     </w:p>
-    <w:bookmarkEnd w:id="28"/>
-    <w:bookmarkEnd w:id="29"/>
+    <w:bookmarkEnd w:id="31"/>
+    <w:bookmarkEnd w:id="32"/>
     <w:sectPr>
       <w:footnotePr>
         <w:numRestart w:val="eachSect"/>

</xml_diff>